<commit_message>
Portafolio = VIDEO diario enviado a la academia, minimos por nivel (A1 1 / A2 2 / B1 3 / B2 5 min), audio solo excepcional 2/semana; entrada de cada nivel = final del anterior + oral grabado en Clase 1. Aplicado en anexo garantia v2.2, kit, hoja de llamadas, respuesta a Paula e info institucional
Co-Authored-By: Claude Fable 5.1 <noreply@anthropic.com>
</commit_message>
<xml_diff>
--- a/recursos/comercial/INDUCCION_COMERCIAL/HOJA_LLAMADAS_GERENCIA.docx
+++ b/recursos/comercial/INDUCCION_COMERCIAL/HOJA_LLAMADAS_GERENCIA.docx
@@ -166,7 +166,7 @@
         <w:rPr>
           <w:sz w:val="18"/>
         </w:rPr>
-        <w:t>garantía por escrito · avance medido (EF SET, audios, reportes) · institución con licencia e ICONTEC · formación del carácter.</w:t>
+        <w:t>garantía por escrito · avance medido (EF SET, videos diarios, reportes) · institución con licencia e ICONTEC · formación del carácter.</w:t>
       </w:r>
     </w:p>
     <w:p>
@@ -647,7 +647,7 @@
         <w:rPr>
           <w:sz w:val="18"/>
         </w:rPr>
-        <w:t>□ Registrar el contacto en la planilla desde la primera llamada (canal, qué se ofreció, próximo paso, motivo real si no cierra).   □ Preguntar Cajasan.   □ Pedir el EF SET antes de la cita.   □ Anunciar las dos jornadas y la regla del grupo mínimo ANTES de firmar.   □ La frase del expediente: garantía y audio diario se firman juntos.   □ Una frase de cierre y SILENCIO: el primero que habla, concede.   □ Si no cierra hoy: oferta por escrito con vencimiento + abono ofrecido + seguimiento pautado (mismo día resumen → +24h mensaje → +48h llamada → día 3 "vence hoy").</w:t>
+        <w:t>□ Registrar el contacto en la planilla desde la primera llamada (canal, qué se ofreció, próximo paso, motivo real si no cierra).   □ Preguntar Cajasan.   □ Pedir el EF SET antes de la cita.   □ Anunciar las dos jornadas y la regla del grupo mínimo ANTES de firmar.   □ La frase del expediente: garantía y video diario se firman juntos (A1 1 min · A2 2 · B1 3 · B2 5).   □ Una frase de cierre y SILENCIO: el primero que habla, concede.   □ Si no cierra hoy: oferta por escrito con vencimiento + abono ofrecido + seguimiento pautado (mismo día resumen → +24h mensaje → +48h llamada → día 3 "vence hoy").</w:t>
       </w:r>
     </w:p>
     <w:p>

</xml_diff>

<commit_message>
Cajasan = columna TRANSFORMACION en todos los paquetes sin importar estrato (45 contado / 36 cuotas en el completo; nivel suelto 30; Arranque sin beca), verificado con carne o certificado. Aplicado en kit, DUDA 7 corregida, aclaracion de becas, hoja de llamadas y respuesta a Paula
Co-Authored-By: Claude Fable 5.1 <noreply@anthropic.com>
</commit_message>
<xml_diff>
--- a/recursos/comercial/INDUCCION_COMERCIAL/HOJA_LLAMADAS_GERENCIA.docx
+++ b/recursos/comercial/INDUCCION_COMERCIAL/HOJA_LLAMADAS_GERENCIA.docx
@@ -96,7 +96,7 @@
         <w:rPr>
           <w:sz w:val="18"/>
         </w:rPr>
-        <w:t>¿Has estudiado inglés antes y cómo te fue? · ¿Para qué lo necesitas: montar algo tuyo, irte a trabajar afuera, tu trabajo actual? · ¿Eres afiliado a Cajasan? (se anota siempre).</w:t>
+        <w:t>¿Has estudiado inglés antes y cómo te fue? · ¿Para qué lo necesitas: montar algo tuyo, irte a trabajar afuera, tu trabajo actual? · ¿Eres afiliado a Cajasan? (se anota siempre: el afiliado entra a Transformación).</w:t>
       </w:r>
     </w:p>
     <w:p>
@@ -389,7 +389,7 @@
               <w:rPr>
                 <w:sz w:val="17"/>
               </w:rPr>
-              <w:t>Transformación (estrato 1–2 con soporte) 45% · General 32% · Ejecutivo (paga empresa) 15%. General de contado: $5.913.280. Cuotas: motor de cuotas, nunca de memoria.</w:t>
+              <w:t>Transformación (estrato 1–2 con soporte, o afiliado a Cajasan con carné) 45% · General 32% · Ejecutivo (paga empresa) 15%. General de contado: $5.913.280. Cuotas: motor de cuotas, nunca de memoria.</w:t>
             </w:r>
           </w:p>
         </w:tc>

</xml_diff>